<commit_message>
Agregar secciones de repositorio al manual técnico DICRI con instrucciones de clonación para frontend, backend y documentación
</commit_message>
<xml_diff>
--- a/MANUAL_TECNICO_DICRI.docx
+++ b/MANUAL_TECNICO_DICRI.docx
@@ -2553,13 +2553,7 @@
         <w:ind w:firstLine="0"/>
       </w:pPr>
       <w:r>
-        <w:t>despliegue y mantenimiento del Sistema</w:t>
-      </w:r>
-      <w:r>
-        <w:t xml:space="preserve"> DICRI</w:t>
-      </w:r>
-      <w:r>
-        <w:t xml:space="preserve">, abarcando los componentes </w:t>
+        <w:t xml:space="preserve">despliegue y mantenimiento del Sistema DICRI, abarcando los componentes </w:t>
       </w:r>
       <w:proofErr w:type="spellStart"/>
       <w:r>
@@ -3043,6 +3037,9 @@
         <w:ind w:firstLine="0"/>
       </w:pPr>
       <w:r>
+        <w:rPr>
+          <w:noProof/>
+        </w:rPr>
         <w:drawing>
           <wp:inline distT="0" distB="0" distL="0" distR="0" wp14:anchorId="766BB0F2" wp14:editId="44EF3AD0">
             <wp:extent cx="5943600" cy="4486910"/>
@@ -4037,19 +4034,8 @@
                 <w:sz w:val="22"/>
                 <w:lang w:eastAsia="ko-KR"/>
               </w:rPr>
-              <w:t xml:space="preserve"> </w:t>
+              <w:t xml:space="preserve"> Js</w:t>
             </w:r>
-            <w:proofErr w:type="spellStart"/>
-            <w:r>
-              <w:rPr>
-                <w:rFonts w:ascii="Aptos Narrow" w:eastAsia="Times New Roman" w:hAnsi="Aptos Narrow" w:cs="Times New Roman"/>
-                <w:color w:val="000000"/>
-                <w:sz w:val="22"/>
-                <w:lang w:eastAsia="ko-KR"/>
-              </w:rPr>
-              <w:t>Js</w:t>
-            </w:r>
-            <w:proofErr w:type="spellEnd"/>
           </w:p>
         </w:tc>
       </w:tr>
@@ -4285,13 +4271,7 @@
         <w:ind w:firstLine="0"/>
       </w:pPr>
       <w:r>
-        <w:t>Todas las comunicaciones se realizan mediante protocolo HTTPS, garantizando cifrado</w:t>
-      </w:r>
-      <w:r>
-        <w:t xml:space="preserve"> </w:t>
-      </w:r>
-      <w:r>
-        <w:t xml:space="preserve">extremo a extremo. Se implementan políticas de CORS en el </w:t>
+        <w:t xml:space="preserve">Todas las comunicaciones se realizan mediante protocolo HTTPS, garantizando cifrado extremo a extremo. Se implementan políticas de CORS en el </w:t>
       </w:r>
       <w:proofErr w:type="spellStart"/>
       <w:r>
@@ -4299,31 +4279,7 @@
       </w:r>
       <w:proofErr w:type="spellEnd"/>
       <w:r>
-        <w:t xml:space="preserve"> para permitir el</w:t>
-      </w:r>
-      <w:r>
-        <w:t xml:space="preserve"> </w:t>
-      </w:r>
-      <w:r>
-        <w:t>acceso controlado desde dominios autorizados. Los tokens JWT caducan</w:t>
-      </w:r>
-      <w:r>
-        <w:t xml:space="preserve"> </w:t>
-      </w:r>
-      <w:r>
-        <w:t>automáticamente para evitar accesos prolongados. Los roles dentro del sistema restringen</w:t>
-      </w:r>
-      <w:r>
-        <w:t xml:space="preserve"> </w:t>
-      </w:r>
-      <w:r>
-        <w:t>la visibilidad de funcionalidades. Los Registros en bitácora permiten monitorear y auditar</w:t>
-      </w:r>
-      <w:r>
-        <w:t xml:space="preserve"> </w:t>
-      </w:r>
-      <w:r>
-        <w:t>acciones críticas del sistema.</w:t>
+        <w:t xml:space="preserve"> para permitir el acceso controlado desde dominios autorizados. Los tokens JWT caducan automáticamente para evitar accesos prolongados. Los roles dentro del sistema restringen la visibilidad de funcionalidades. Los Registros en bitácora permiten monitorear y auditar acciones críticas del sistema.</w:t>
       </w:r>
     </w:p>
     <w:p>
@@ -5704,12 +5660,262 @@
     </w:p>
     <w:p>
       <w:pPr>
+        <w:spacing w:after="160" w:line="278" w:lineRule="auto"/>
         <w:ind w:firstLine="0"/>
-      </w:pPr>
-    </w:p>
-    <w:p/>
+        <w:jc w:val="left"/>
+      </w:pPr>
+      <w:r>
+        <w:br w:type="page"/>
+      </w:r>
+    </w:p>
+    <w:p>
+      <w:pPr>
+        <w:pStyle w:val="Ttulo1"/>
+        <w:numPr>
+          <w:ilvl w:val="1"/>
+          <w:numId w:val="1"/>
+        </w:numPr>
+        <w:rPr>
+          <w:rFonts w:ascii="Times New Roman" w:hAnsi="Times New Roman" w:cs="Times New Roman"/>
+          <w:sz w:val="56"/>
+          <w:szCs w:val="56"/>
+        </w:rPr>
+      </w:pPr>
+      <w:r>
+        <w:rPr>
+          <w:rFonts w:ascii="Times New Roman" w:hAnsi="Times New Roman" w:cs="Times New Roman"/>
+          <w:noProof/>
+          <w:sz w:val="56"/>
+          <w:szCs w:val="56"/>
+          <w:lang w:bidi="es-ES"/>
+        </w:rPr>
+        <w:lastRenderedPageBreak/>
+        <w:drawing>
+          <wp:anchor distT="0" distB="0" distL="114300" distR="114300" simplePos="0" relativeHeight="251699200" behindDoc="1" locked="0" layoutInCell="1" allowOverlap="1" wp14:anchorId="4D9BB21B" wp14:editId="690C99B0">
+            <wp:simplePos x="0" y="0"/>
+            <wp:positionH relativeFrom="page">
+              <wp:posOffset>2259203</wp:posOffset>
+            </wp:positionH>
+            <wp:positionV relativeFrom="paragraph">
+              <wp:posOffset>-2643601</wp:posOffset>
+            </wp:positionV>
+            <wp:extent cx="1710055" cy="6570293"/>
+            <wp:effectExtent l="122873" t="0" r="89217" b="0"/>
+            <wp:wrapNone/>
+            <wp:docPr id="1924385201" name="Gráfico 1924385201" descr="rectángulo transparente de color"/>
+            <wp:cNvGraphicFramePr>
+              <a:graphicFrameLocks xmlns:a="http://schemas.openxmlformats.org/drawingml/2006/main" noChangeAspect="1"/>
+            </wp:cNvGraphicFramePr>
+            <a:graphic xmlns:a="http://schemas.openxmlformats.org/drawingml/2006/main">
+              <a:graphicData uri="http://schemas.openxmlformats.org/drawingml/2006/picture">
+                <pic:pic xmlns:pic="http://schemas.openxmlformats.org/drawingml/2006/picture">
+                  <pic:nvPicPr>
+                    <pic:cNvPr id="1" name=""/>
+                    <pic:cNvPicPr/>
+                  </pic:nvPicPr>
+                  <pic:blipFill>
+                    <a:blip r:embed="rId10">
+                      <a:extLst>
+                        <a:ext uri="{96DAC541-7B7A-43D3-8B79-37D633B846F1}">
+                          <asvg:svgBlip xmlns:asvg="http://schemas.microsoft.com/office/drawing/2016/SVG/main" r:embed="rId11"/>
+                        </a:ext>
+                      </a:extLst>
+                    </a:blip>
+                    <a:stretch>
+                      <a:fillRect/>
+                    </a:stretch>
+                  </pic:blipFill>
+                  <pic:spPr>
+                    <a:xfrm rot="4654508">
+                      <a:off x="0" y="0"/>
+                      <a:ext cx="1710055" cy="6570293"/>
+                    </a:xfrm>
+                    <a:prstGeom prst="rect">
+                      <a:avLst/>
+                    </a:prstGeom>
+                  </pic:spPr>
+                </pic:pic>
+              </a:graphicData>
+            </a:graphic>
+            <wp14:sizeRelH relativeFrom="margin">
+              <wp14:pctWidth>0</wp14:pctWidth>
+            </wp14:sizeRelH>
+            <wp14:sizeRelV relativeFrom="margin">
+              <wp14:pctHeight>0</wp14:pctHeight>
+            </wp14:sizeRelV>
+          </wp:anchor>
+        </w:drawing>
+      </w:r>
+      <w:r>
+        <w:rPr>
+          <w:rFonts w:ascii="Times New Roman" w:hAnsi="Times New Roman" w:cs="Times New Roman"/>
+          <w:sz w:val="56"/>
+          <w:szCs w:val="56"/>
+        </w:rPr>
+        <w:t>Repositorio</w:t>
+      </w:r>
+    </w:p>
+    <w:p>
+      <w:pPr>
+        <w:ind w:firstLine="0"/>
+      </w:pPr>
+    </w:p>
+    <w:p>
+      <w:pPr>
+        <w:pStyle w:val="Ttulo3"/>
+        <w:rPr>
+          <w:lang w:val="en-US"/>
+        </w:rPr>
+      </w:pPr>
+      <w:r>
+        <w:rPr>
+          <w:lang w:val="en-US"/>
+        </w:rPr>
+        <w:t>FRONTEND</w:t>
+      </w:r>
+    </w:p>
+    <w:p>
+      <w:pPr>
+        <w:rPr>
+          <w:lang w:val="en-US"/>
+        </w:rPr>
+      </w:pPr>
+      <w:r>
+        <w:rPr>
+          <w:lang w:val="en-US"/>
+        </w:rPr>
+        <w:t>git clone -b frontend https://github.com/Juarezgump655/expedientes.git</w:t>
+      </w:r>
+    </w:p>
+    <w:p>
+      <w:pPr>
+        <w:rPr>
+          <w:lang w:val="en-US"/>
+        </w:rPr>
+      </w:pPr>
+    </w:p>
+    <w:p>
+      <w:pPr>
+        <w:pStyle w:val="Ttulo3"/>
+        <w:rPr>
+          <w:lang w:val="en-US"/>
+        </w:rPr>
+      </w:pPr>
+      <w:r>
+        <w:rPr>
+          <w:lang w:val="en-US"/>
+        </w:rPr>
+        <w:t>BACK</w:t>
+      </w:r>
+    </w:p>
+    <w:p>
+      <w:pPr>
+        <w:rPr>
+          <w:lang w:val="en-US"/>
+        </w:rPr>
+      </w:pPr>
+      <w:r>
+        <w:rPr>
+          <w:lang w:val="en-US"/>
+        </w:rPr>
+        <w:t xml:space="preserve">git clone -b back </w:t>
+      </w:r>
+      <w:hyperlink r:id="rId14" w:history="1">
+        <w:r>
+          <w:rPr>
+            <w:rStyle w:val="Hipervnculo"/>
+            <w:lang w:val="en-US"/>
+          </w:rPr>
+          <w:t>https://github.com/Juarezgump655/expedientes.git</w:t>
+        </w:r>
+      </w:hyperlink>
+    </w:p>
+    <w:p>
+      <w:pPr>
+        <w:rPr>
+          <w:lang w:val="en-US"/>
+        </w:rPr>
+      </w:pPr>
+    </w:p>
+    <w:p>
+      <w:pPr>
+        <w:pStyle w:val="Ttulo3"/>
+      </w:pPr>
+      <w:r>
+        <w:t>DOCUMENTACIÓN</w:t>
+      </w:r>
+    </w:p>
+    <w:p>
+      <w:pPr>
+        <w:rPr>
+          <w:lang w:val="en-US"/>
+        </w:rPr>
+      </w:pPr>
+      <w:r>
+        <w:rPr>
+          <w:lang w:val="en-US"/>
+        </w:rPr>
+        <w:t xml:space="preserve">git clone -b </w:t>
+      </w:r>
+      <w:r>
+        <w:rPr>
+          <w:lang w:val="en-US"/>
+        </w:rPr>
+        <w:t>d</w:t>
+      </w:r>
+      <w:r>
+        <w:rPr>
+          <w:lang w:val="en-US"/>
+        </w:rPr>
+        <w:t>oc-</w:t>
+      </w:r>
+      <w:proofErr w:type="spellStart"/>
+      <w:r>
+        <w:rPr>
+          <w:lang w:val="en-US"/>
+        </w:rPr>
+        <w:t>rama</w:t>
+      </w:r>
+      <w:proofErr w:type="spellEnd"/>
+      <w:r>
+        <w:rPr>
+          <w:lang w:val="en-US"/>
+        </w:rPr>
+        <w:t xml:space="preserve"> </w:t>
+      </w:r>
+      <w:hyperlink r:id="rId15" w:history="1">
+        <w:r>
+          <w:rPr>
+            <w:rStyle w:val="Hipervnculo"/>
+            <w:lang w:val="en-US"/>
+          </w:rPr>
+          <w:t>https://github.com/Juarezgump655/expedientes.git</w:t>
+        </w:r>
+      </w:hyperlink>
+    </w:p>
+    <w:p>
+      <w:pPr>
+        <w:rPr>
+          <w:lang w:val="en-US"/>
+        </w:rPr>
+      </w:pPr>
+    </w:p>
+    <w:p>
+      <w:pPr>
+        <w:rPr>
+          <w:lang w:val="en-US"/>
+        </w:rPr>
+      </w:pPr>
+    </w:p>
+    <w:p>
+      <w:pPr>
+        <w:rPr>
+          <w:lang w:val="en-US"/>
+        </w:rPr>
+      </w:pPr>
+    </w:p>
     <w:sectPr>
-      <w:footerReference w:type="default" r:id="rId14"/>
+      <w:footerReference w:type="default" r:id="rId16"/>
       <w:pgSz w:w="12240" w:h="15840"/>
       <w:pgMar w:top="1440" w:right="1440" w:bottom="1440" w:left="1440" w:header="708" w:footer="708" w:gutter="0"/>
       <w:pgNumType w:start="1"/>
@@ -8888,6 +9094,151 @@
     </w:lvl>
   </w:abstractNum>
   <w:abstractNum w:abstractNumId="22" w15:restartNumberingAfterBreak="0">
+    <w:nsid w:val="56745A43"/>
+    <w:multiLevelType w:val="multilevel"/>
+    <w:tmpl w:val="BE322BD6"/>
+    <w:lvl w:ilvl="0">
+      <w:start w:val="1"/>
+      <w:numFmt w:val="decimal"/>
+      <w:lvlText w:val="%1."/>
+      <w:lvlJc w:val="left"/>
+      <w:pPr>
+        <w:tabs>
+          <w:tab w:val="num" w:pos="720"/>
+        </w:tabs>
+        <w:ind w:left="720" w:hanging="360"/>
+      </w:pPr>
+      <w:rPr>
+        <w:rFonts w:hint="default"/>
+        <w:sz w:val="20"/>
+      </w:rPr>
+    </w:lvl>
+    <w:lvl w:ilvl="1">
+      <w:start w:val="1"/>
+      <w:numFmt w:val="upperRoman"/>
+      <w:lvlText w:val="%2."/>
+      <w:lvlJc w:val="left"/>
+      <w:pPr>
+        <w:ind w:left="1800" w:hanging="720"/>
+      </w:pPr>
+      <w:rPr>
+        <w:rFonts w:hint="default"/>
+      </w:rPr>
+    </w:lvl>
+    <w:lvl w:ilvl="2">
+      <w:start w:val="1"/>
+      <w:numFmt w:val="bullet"/>
+      <w:lvlText w:val=""/>
+      <w:lvlJc w:val="left"/>
+      <w:pPr>
+        <w:tabs>
+          <w:tab w:val="num" w:pos="2160"/>
+        </w:tabs>
+        <w:ind w:left="2160" w:hanging="360"/>
+      </w:pPr>
+      <w:rPr>
+        <w:rFonts w:ascii="Wingdings" w:hAnsi="Wingdings" w:hint="default"/>
+        <w:sz w:val="20"/>
+      </w:rPr>
+    </w:lvl>
+    <w:lvl w:ilvl="3">
+      <w:start w:val="1"/>
+      <w:numFmt w:val="decimal"/>
+      <w:lvlText w:val="%4."/>
+      <w:lvlJc w:val="left"/>
+      <w:pPr>
+        <w:tabs>
+          <w:tab w:val="num" w:pos="2880"/>
+        </w:tabs>
+        <w:ind w:left="2880" w:hanging="360"/>
+      </w:pPr>
+      <w:rPr>
+        <w:rFonts w:ascii="Times New Roman" w:eastAsiaTheme="minorHAnsi" w:hAnsi="Times New Roman" w:cstheme="minorBidi"/>
+        <w:sz w:val="20"/>
+      </w:rPr>
+    </w:lvl>
+    <w:lvl w:ilvl="4" w:tentative="1">
+      <w:start w:val="1"/>
+      <w:numFmt w:val="bullet"/>
+      <w:lvlText w:val=""/>
+      <w:lvlJc w:val="left"/>
+      <w:pPr>
+        <w:tabs>
+          <w:tab w:val="num" w:pos="3600"/>
+        </w:tabs>
+        <w:ind w:left="3600" w:hanging="360"/>
+      </w:pPr>
+      <w:rPr>
+        <w:rFonts w:ascii="Wingdings" w:hAnsi="Wingdings" w:hint="default"/>
+        <w:sz w:val="20"/>
+      </w:rPr>
+    </w:lvl>
+    <w:lvl w:ilvl="5" w:tentative="1">
+      <w:start w:val="1"/>
+      <w:numFmt w:val="bullet"/>
+      <w:lvlText w:val=""/>
+      <w:lvlJc w:val="left"/>
+      <w:pPr>
+        <w:tabs>
+          <w:tab w:val="num" w:pos="4320"/>
+        </w:tabs>
+        <w:ind w:left="4320" w:hanging="360"/>
+      </w:pPr>
+      <w:rPr>
+        <w:rFonts w:ascii="Wingdings" w:hAnsi="Wingdings" w:hint="default"/>
+        <w:sz w:val="20"/>
+      </w:rPr>
+    </w:lvl>
+    <w:lvl w:ilvl="6" w:tentative="1">
+      <w:start w:val="1"/>
+      <w:numFmt w:val="bullet"/>
+      <w:lvlText w:val=""/>
+      <w:lvlJc w:val="left"/>
+      <w:pPr>
+        <w:tabs>
+          <w:tab w:val="num" w:pos="5040"/>
+        </w:tabs>
+        <w:ind w:left="5040" w:hanging="360"/>
+      </w:pPr>
+      <w:rPr>
+        <w:rFonts w:ascii="Wingdings" w:hAnsi="Wingdings" w:hint="default"/>
+        <w:sz w:val="20"/>
+      </w:rPr>
+    </w:lvl>
+    <w:lvl w:ilvl="7" w:tentative="1">
+      <w:start w:val="1"/>
+      <w:numFmt w:val="bullet"/>
+      <w:lvlText w:val=""/>
+      <w:lvlJc w:val="left"/>
+      <w:pPr>
+        <w:tabs>
+          <w:tab w:val="num" w:pos="5760"/>
+        </w:tabs>
+        <w:ind w:left="5760" w:hanging="360"/>
+      </w:pPr>
+      <w:rPr>
+        <w:rFonts w:ascii="Wingdings" w:hAnsi="Wingdings" w:hint="default"/>
+        <w:sz w:val="20"/>
+      </w:rPr>
+    </w:lvl>
+    <w:lvl w:ilvl="8" w:tentative="1">
+      <w:start w:val="1"/>
+      <w:numFmt w:val="bullet"/>
+      <w:lvlText w:val=""/>
+      <w:lvlJc w:val="left"/>
+      <w:pPr>
+        <w:tabs>
+          <w:tab w:val="num" w:pos="6480"/>
+        </w:tabs>
+        <w:ind w:left="6480" w:hanging="360"/>
+      </w:pPr>
+      <w:rPr>
+        <w:rFonts w:ascii="Wingdings" w:hAnsi="Wingdings" w:hint="default"/>
+        <w:sz w:val="20"/>
+      </w:rPr>
+    </w:lvl>
+  </w:abstractNum>
+  <w:abstractNum w:abstractNumId="23" w15:restartNumberingAfterBreak="0">
     <w:nsid w:val="58B9065E"/>
     <w:multiLevelType w:val="multilevel"/>
     <w:tmpl w:val="E7B4A2D6"/>
@@ -9036,7 +9387,7 @@
       </w:rPr>
     </w:lvl>
   </w:abstractNum>
-  <w:abstractNum w:abstractNumId="23" w15:restartNumberingAfterBreak="0">
+  <w:abstractNum w:abstractNumId="24" w15:restartNumberingAfterBreak="0">
     <w:nsid w:val="5B371CAB"/>
     <w:multiLevelType w:val="multilevel"/>
     <w:tmpl w:val="FFEA76F0"/>
@@ -9185,7 +9536,7 @@
       </w:rPr>
     </w:lvl>
   </w:abstractNum>
-  <w:abstractNum w:abstractNumId="24" w15:restartNumberingAfterBreak="0">
+  <w:abstractNum w:abstractNumId="25" w15:restartNumberingAfterBreak="0">
     <w:nsid w:val="5B482FEB"/>
     <w:multiLevelType w:val="hybridMultilevel"/>
     <w:tmpl w:val="04C67C06"/>
@@ -9298,7 +9649,7 @@
       </w:rPr>
     </w:lvl>
   </w:abstractNum>
-  <w:abstractNum w:abstractNumId="25" w15:restartNumberingAfterBreak="0">
+  <w:abstractNum w:abstractNumId="26" w15:restartNumberingAfterBreak="0">
     <w:nsid w:val="5CE62660"/>
     <w:multiLevelType w:val="hybridMultilevel"/>
     <w:tmpl w:val="D45A21B4"/>
@@ -9411,7 +9762,7 @@
       </w:rPr>
     </w:lvl>
   </w:abstractNum>
-  <w:abstractNum w:abstractNumId="26" w15:restartNumberingAfterBreak="0">
+  <w:abstractNum w:abstractNumId="27" w15:restartNumberingAfterBreak="0">
     <w:nsid w:val="67672FEE"/>
     <w:multiLevelType w:val="multilevel"/>
     <w:tmpl w:val="078CC2E2"/>
@@ -9560,7 +9911,7 @@
       </w:rPr>
     </w:lvl>
   </w:abstractNum>
-  <w:abstractNum w:abstractNumId="27" w15:restartNumberingAfterBreak="0">
+  <w:abstractNum w:abstractNumId="28" w15:restartNumberingAfterBreak="0">
     <w:nsid w:val="6B532120"/>
     <w:multiLevelType w:val="hybridMultilevel"/>
     <w:tmpl w:val="0D8AED04"/>
@@ -9673,7 +10024,7 @@
       </w:rPr>
     </w:lvl>
   </w:abstractNum>
-  <w:abstractNum w:abstractNumId="28" w15:restartNumberingAfterBreak="0">
+  <w:abstractNum w:abstractNumId="29" w15:restartNumberingAfterBreak="0">
     <w:nsid w:val="702B61EB"/>
     <w:multiLevelType w:val="multilevel"/>
     <w:tmpl w:val="5D528982"/>
@@ -9822,7 +10173,7 @@
       </w:rPr>
     </w:lvl>
   </w:abstractNum>
-  <w:abstractNum w:abstractNumId="29" w15:restartNumberingAfterBreak="0">
+  <w:abstractNum w:abstractNumId="30" w15:restartNumberingAfterBreak="0">
     <w:nsid w:val="712B5455"/>
     <w:multiLevelType w:val="hybridMultilevel"/>
     <w:tmpl w:val="F07EA360"/>
@@ -9935,7 +10286,7 @@
       </w:rPr>
     </w:lvl>
   </w:abstractNum>
-  <w:abstractNum w:abstractNumId="30" w15:restartNumberingAfterBreak="0">
+  <w:abstractNum w:abstractNumId="31" w15:restartNumberingAfterBreak="0">
     <w:nsid w:val="77FB2ABD"/>
     <w:multiLevelType w:val="multilevel"/>
     <w:tmpl w:val="1BE221B8"/>
@@ -10083,10 +10434,10 @@
     <w:abstractNumId w:val="19"/>
   </w:num>
   <w:num w:numId="3" w16cid:durableId="1465848595">
-    <w:abstractNumId w:val="29"/>
+    <w:abstractNumId w:val="30"/>
   </w:num>
   <w:num w:numId="4" w16cid:durableId="1078287044">
-    <w:abstractNumId w:val="30"/>
+    <w:abstractNumId w:val="31"/>
     <w:lvlOverride w:ilvl="1">
       <w:lvl w:ilvl="1">
         <w:numFmt w:val="bullet"/>
@@ -10115,10 +10466,10 @@
     <w:abstractNumId w:val="4"/>
   </w:num>
   <w:num w:numId="8" w16cid:durableId="69694457">
-    <w:abstractNumId w:val="27"/>
+    <w:abstractNumId w:val="28"/>
   </w:num>
   <w:num w:numId="9" w16cid:durableId="319892915">
-    <w:abstractNumId w:val="25"/>
+    <w:abstractNumId w:val="26"/>
   </w:num>
   <w:num w:numId="10" w16cid:durableId="2127891994">
     <w:abstractNumId w:val="15"/>
@@ -10139,13 +10490,13 @@
     <w:abstractNumId w:val="13"/>
   </w:num>
   <w:num w:numId="16" w16cid:durableId="891500836">
-    <w:abstractNumId w:val="24"/>
+    <w:abstractNumId w:val="25"/>
   </w:num>
   <w:num w:numId="17" w16cid:durableId="276958024">
     <w:abstractNumId w:val="20"/>
   </w:num>
   <w:num w:numId="18" w16cid:durableId="1555433349">
-    <w:abstractNumId w:val="28"/>
+    <w:abstractNumId w:val="29"/>
   </w:num>
   <w:num w:numId="19" w16cid:durableId="1908877712">
     <w:abstractNumId w:val="6"/>
@@ -10157,7 +10508,7 @@
     <w:abstractNumId w:val="1"/>
   </w:num>
   <w:num w:numId="22" w16cid:durableId="129129302">
-    <w:abstractNumId w:val="26"/>
+    <w:abstractNumId w:val="27"/>
   </w:num>
   <w:num w:numId="23" w16cid:durableId="2107193091">
     <w:abstractNumId w:val="17"/>
@@ -10166,7 +10517,7 @@
     <w:abstractNumId w:val="10"/>
   </w:num>
   <w:num w:numId="25" w16cid:durableId="902057889">
-    <w:abstractNumId w:val="23"/>
+    <w:abstractNumId w:val="24"/>
   </w:num>
   <w:num w:numId="26" w16cid:durableId="1762146014">
     <w:abstractNumId w:val="2"/>
@@ -10181,10 +10532,13 @@
     <w:abstractNumId w:val="5"/>
   </w:num>
   <w:num w:numId="30" w16cid:durableId="820270760">
-    <w:abstractNumId w:val="22"/>
+    <w:abstractNumId w:val="23"/>
   </w:num>
   <w:num w:numId="31" w16cid:durableId="1383284355">
     <w:abstractNumId w:val="8"/>
+  </w:num>
+  <w:num w:numId="32" w16cid:durableId="2006280054">
+    <w:abstractNumId w:val="22"/>
   </w:num>
 </w:numbering>
 </file>
@@ -10589,7 +10943,7 @@
   <w:style w:type="paragraph" w:default="1" w:styleId="Normal">
     <w:name w:val="Normal"/>
     <w:qFormat/>
-    <w:rsid w:val="00D869A2"/>
+    <w:rsid w:val="005627B9"/>
     <w:pPr>
       <w:spacing w:after="0" w:line="360" w:lineRule="auto"/>
       <w:ind w:firstLine="284"/>
@@ -10799,6 +11153,7 @@
   <w:style w:type="character" w:default="1" w:styleId="Fuentedeprrafopredeter">
     <w:name w:val="Default Paragraph Font"/>
     <w:uiPriority w:val="1"/>
+    <w:semiHidden/>
     <w:unhideWhenUsed/>
   </w:style>
   <w:style w:type="table" w:default="1" w:styleId="Tablanormal">

</xml_diff>